<commit_message>
Phase 20 (Reports & Analytics)
</commit_message>
<xml_diff>
--- a/Z docx file/New Microsoft Word Document.docx
+++ b/Z docx file/New Microsoft Word Document.docx
@@ -33723,19 +33723,34 @@
           <w:rFonts w:ascii="Nirmala UI" w:hAnsi="Nirmala UI" w:cs="Nirmala UI"/>
         </w:rPr>
       </w:pPr>
+      <w:r>
+        <w:rPr>
+          <w:rFonts w:ascii="Nirmala UI" w:hAnsi="Nirmala UI" w:cs="Nirmala UI"/>
+        </w:rPr>
+        <w:tab/>
+      </w:r>
+    </w:p>
+    <w:p>
+      <w:r>
+        <w:t>File structure</w:t>
+      </w:r>
+    </w:p>
+    <w:p>
+      <w:proofErr w:type="spellStart"/>
+      <w:r>
+        <w:t>npm</w:t>
+      </w:r>
+      <w:proofErr w:type="spellEnd"/>
+      <w:r>
+        <w:t xml:space="preserve"> install </w:t>
+      </w:r>
+      <w:proofErr w:type="spellStart"/>
+      <w:r>
+        <w:t>recharts</w:t>
+      </w:r>
       <w:bookmarkStart w:id="0" w:name="_GoBack"/>
-      <w:r>
-        <w:rPr>
-          <w:rFonts w:ascii="Nirmala UI" w:hAnsi="Nirmala UI" w:cs="Nirmala UI"/>
-        </w:rPr>
-        <w:tab/>
-      </w:r>
-    </w:p>
-    <w:bookmarkEnd w:id="0"/>
-    <w:p>
-      <w:r>
-        <w:t>File structure</w:t>
-      </w:r>
+      <w:bookmarkEnd w:id="0"/>
+      <w:proofErr w:type="spellEnd"/>
     </w:p>
     <w:sectPr>
       <w:pgSz w:w="12240" w:h="15840"/>

</xml_diff>

<commit_message>
Phase 21 : Complit
</commit_message>
<xml_diff>
--- a/Z docx file/New Microsoft Word Document.docx
+++ b/Z docx file/New Microsoft Word Document.docx
@@ -32736,16 +32736,9 @@
           <w:rFonts w:asciiTheme="majorBidi" w:hAnsiTheme="majorBidi" w:cstheme="majorBidi"/>
         </w:rPr>
       </w:pPr>
-    </w:p>
-    <w:p>
-      <w:pPr>
-        <w:rPr>
-          <w:rFonts w:asciiTheme="majorBidi" w:hAnsiTheme="majorBidi" w:cstheme="majorBidi"/>
-        </w:rPr>
-      </w:pPr>
-      <w:r>
-        <w:rPr>
-          <w:rFonts w:ascii="Nirmala UI" w:hAnsi="Nirmala UI" w:cs="Nirmala UI" w:hint="cs"/>
+      <w:r>
+        <w:rPr>
+          <w:rFonts w:ascii="Nirmala UI" w:hAnsi="Nirmala UI" w:cs="Nirmala UI"/>
           <w:cs/>
           <w:lang w:bidi="bn-IN"/>
         </w:rPr>
@@ -32753,15 +32746,15 @@
       </w:r>
       <w:r>
         <w:rPr>
-          <w:rFonts w:asciiTheme="majorBidi" w:hAnsiTheme="majorBidi" w:cstheme="majorBidi"/>
-          <w:cs/>
-          <w:lang w:bidi="bn-IN"/>
-        </w:rPr>
-        <w:t xml:space="preserve"> </w:t>
-      </w:r>
-      <w:r>
-        <w:rPr>
-          <w:rFonts w:ascii="Nirmala UI" w:hAnsi="Nirmala UI" w:cs="Nirmala UI" w:hint="cs"/>
+          <w:rFonts w:asciiTheme="majorBidi" w:hAnsiTheme="majorBidi" w:cs="Nirmala UI"/>
+          <w:cs/>
+          <w:lang w:bidi="bn-IN"/>
+        </w:rPr>
+        <w:t xml:space="preserve"> </w:t>
+      </w:r>
+      <w:r>
+        <w:rPr>
+          <w:rFonts w:ascii="Nirmala UI" w:hAnsi="Nirmala UI" w:cs="Nirmala UI"/>
           <w:cs/>
           <w:lang w:bidi="bn-IN"/>
         </w:rPr>
@@ -32769,15 +32762,15 @@
       </w:r>
       <w:r>
         <w:rPr>
-          <w:rFonts w:asciiTheme="majorBidi" w:hAnsiTheme="majorBidi" w:cstheme="majorBidi"/>
-          <w:cs/>
-          <w:lang w:bidi="bn-IN"/>
-        </w:rPr>
-        <w:t xml:space="preserve"> </w:t>
-      </w:r>
-      <w:r>
-        <w:rPr>
-          <w:rFonts w:ascii="Nirmala UI" w:hAnsi="Nirmala UI" w:cs="Nirmala UI" w:hint="cs"/>
+          <w:rFonts w:asciiTheme="majorBidi" w:hAnsiTheme="majorBidi" w:cs="Nirmala UI"/>
+          <w:cs/>
+          <w:lang w:bidi="bn-IN"/>
+        </w:rPr>
+        <w:t xml:space="preserve"> </w:t>
+      </w:r>
+      <w:r>
+        <w:rPr>
+          <w:rFonts w:ascii="Nirmala UI" w:hAnsi="Nirmala UI" w:cs="Nirmala UI"/>
           <w:cs/>
           <w:lang w:bidi="bn-IN"/>
         </w:rPr>
@@ -32785,15 +32778,15 @@
       </w:r>
       <w:r>
         <w:rPr>
-          <w:rFonts w:asciiTheme="majorBidi" w:hAnsiTheme="majorBidi" w:cstheme="majorBidi"/>
-          <w:cs/>
-          <w:lang w:bidi="bn-IN"/>
-        </w:rPr>
-        <w:t xml:space="preserve"> </w:t>
-      </w:r>
-      <w:r>
-        <w:rPr>
-          <w:rFonts w:ascii="Nirmala UI" w:hAnsi="Nirmala UI" w:cs="Nirmala UI" w:hint="cs"/>
+          <w:rFonts w:asciiTheme="majorBidi" w:hAnsiTheme="majorBidi" w:cs="Nirmala UI"/>
+          <w:cs/>
+          <w:lang w:bidi="bn-IN"/>
+        </w:rPr>
+        <w:t xml:space="preserve"> </w:t>
+      </w:r>
+      <w:r>
+        <w:rPr>
+          <w:rFonts w:ascii="Nirmala UI" w:hAnsi="Nirmala UI" w:cs="Nirmala UI"/>
           <w:cs/>
           <w:lang w:bidi="bn-IN"/>
         </w:rPr>
@@ -32801,15 +32794,15 @@
       </w:r>
       <w:r>
         <w:rPr>
-          <w:rFonts w:asciiTheme="majorBidi" w:hAnsiTheme="majorBidi" w:cstheme="majorBidi"/>
-          <w:cs/>
-          <w:lang w:bidi="bn-IN"/>
-        </w:rPr>
-        <w:t xml:space="preserve"> </w:t>
-      </w:r>
-      <w:r>
-        <w:rPr>
-          <w:rFonts w:ascii="Nirmala UI" w:hAnsi="Nirmala UI" w:cs="Nirmala UI" w:hint="cs"/>
+          <w:rFonts w:asciiTheme="majorBidi" w:hAnsiTheme="majorBidi" w:cs="Nirmala UI"/>
+          <w:cs/>
+          <w:lang w:bidi="bn-IN"/>
+        </w:rPr>
+        <w:t xml:space="preserve"> </w:t>
+      </w:r>
+      <w:r>
+        <w:rPr>
+          <w:rFonts w:ascii="Nirmala UI" w:hAnsi="Nirmala UI" w:cs="Nirmala UI"/>
           <w:cs/>
           <w:lang w:bidi="bn-IN"/>
         </w:rPr>
@@ -32817,15 +32810,15 @@
       </w:r>
       <w:r>
         <w:rPr>
-          <w:rFonts w:asciiTheme="majorBidi" w:hAnsiTheme="majorBidi" w:cstheme="majorBidi"/>
-          <w:cs/>
-          <w:lang w:bidi="bn-IN"/>
-        </w:rPr>
-        <w:t xml:space="preserve"> </w:t>
-      </w:r>
-      <w:r>
-        <w:rPr>
-          <w:rFonts w:ascii="Nirmala UI" w:hAnsi="Nirmala UI" w:cs="Nirmala UI" w:hint="cs"/>
+          <w:rFonts w:asciiTheme="majorBidi" w:hAnsiTheme="majorBidi" w:cs="Nirmala UI"/>
+          <w:cs/>
+          <w:lang w:bidi="bn-IN"/>
+        </w:rPr>
+        <w:t xml:space="preserve"> </w:t>
+      </w:r>
+      <w:r>
+        <w:rPr>
+          <w:rFonts w:ascii="Nirmala UI" w:hAnsi="Nirmala UI" w:cs="Nirmala UI"/>
           <w:cs/>
           <w:lang w:bidi="bn-IN"/>
         </w:rPr>
@@ -32833,7 +32826,7 @@
       </w:r>
       <w:r>
         <w:rPr>
-          <w:rFonts w:asciiTheme="majorBidi" w:hAnsiTheme="majorBidi" w:cstheme="majorBidi"/>
+          <w:rFonts w:asciiTheme="majorBidi" w:hAnsiTheme="majorBidi" w:cs="Nirmala UI"/>
           <w:cs/>
           <w:lang w:bidi="bn-IN"/>
         </w:rPr>
@@ -32845,12 +32838,29 @@
           <w:cs/>
           <w:lang w:bidi="bn-IN"/>
         </w:rPr>
-        <w:t>উপরে</w:t>
+        <w:t>উপরে দিয়েছি</w:t>
       </w:r>
       <w:r>
         <w:rPr>
           <w:rFonts w:ascii="Nirmala UI" w:hAnsi="Nirmala UI" w:cs="Nirmala UI"/>
-          <w:lang w:bidi="bn-IN"/>
+          <w:cs/>
+          <w:lang w:bidi="hi-IN"/>
+        </w:rPr>
+        <w:t>।</w:t>
+      </w:r>
+      <w:r>
+        <w:rPr>
+          <w:rFonts w:ascii="Kokila" w:hAnsi="Kokila" w:cs="Kokila"/>
+          <w:cs/>
+          <w:lang w:bidi="hi-IN"/>
+        </w:rPr>
+        <w:t>।</w:t>
+      </w:r>
+      <w:r>
+        <w:rPr>
+          <w:rFonts w:asciiTheme="majorBidi" w:hAnsiTheme="majorBidi" w:cs="Mangal"/>
+          <w:cs/>
+          <w:lang w:bidi="hi-IN"/>
         </w:rPr>
         <w:t xml:space="preserve"> </w:t>
       </w:r>
@@ -32860,59 +32870,27 @@
           <w:cs/>
           <w:lang w:bidi="bn-IN"/>
         </w:rPr>
-        <w:t>দিয়েছি</w:t>
+        <w:t>আমরা</w:t>
+      </w:r>
+      <w:r>
+        <w:rPr>
+          <w:rFonts w:asciiTheme="majorBidi" w:hAnsiTheme="majorBidi" w:cs="Nirmala UI"/>
+          <w:cs/>
+          <w:lang w:bidi="bn-IN"/>
+        </w:rPr>
+        <w:t xml:space="preserve"> </w:t>
       </w:r>
       <w:r>
         <w:rPr>
           <w:rFonts w:ascii="Nirmala UI" w:hAnsi="Nirmala UI" w:cs="Nirmala UI"/>
           <w:cs/>
-          <w:lang w:bidi="hi-IN"/>
-        </w:rPr>
-        <w:t>।</w:t>
-      </w:r>
-      <w:r>
-        <w:rPr>
-          <w:rFonts w:ascii="Kokila" w:hAnsi="Kokila" w:cs="Kokila" w:hint="cs"/>
-          <w:cs/>
-          <w:lang w:bidi="hi-IN"/>
-        </w:rPr>
-        <w:t>।</w:t>
-      </w:r>
-      <w:r>
-        <w:rPr>
-          <w:rFonts w:asciiTheme="majorBidi" w:hAnsiTheme="majorBidi" w:cstheme="majorBidi"/>
-          <w:cs/>
-          <w:lang w:bidi="hi-IN"/>
-        </w:rPr>
-        <w:t xml:space="preserve"> </w:t>
-      </w:r>
-      <w:r>
-        <w:rPr>
-          <w:rFonts w:ascii="Nirmala UI" w:hAnsi="Nirmala UI" w:cs="Nirmala UI" w:hint="cs"/>
-          <w:cs/>
-          <w:lang w:bidi="bn-IN"/>
-        </w:rPr>
-        <w:t>আমরা</w:t>
-      </w:r>
-      <w:r>
-        <w:rPr>
-          <w:rFonts w:asciiTheme="majorBidi" w:hAnsiTheme="majorBidi" w:cstheme="majorBidi"/>
-          <w:cs/>
-          <w:lang w:bidi="bn-IN"/>
-        </w:rPr>
-        <w:t xml:space="preserve"> </w:t>
-      </w:r>
-      <w:r>
-        <w:rPr>
-          <w:rFonts w:ascii="Nirmala UI" w:hAnsi="Nirmala UI" w:cs="Nirmala UI" w:hint="cs"/>
-          <w:cs/>
           <w:lang w:bidi="bn-IN"/>
         </w:rPr>
         <w:t>এখন</w:t>
       </w:r>
       <w:r>
         <w:rPr>
-          <w:rFonts w:asciiTheme="majorBidi" w:hAnsiTheme="majorBidi" w:cstheme="majorBidi"/>
+          <w:rFonts w:asciiTheme="majorBidi" w:hAnsiTheme="majorBidi" w:cs="Nirmala UI"/>
           <w:cs/>
           <w:lang w:bidi="bn-IN"/>
         </w:rPr>
@@ -32922,23 +32900,11 @@
         <w:rPr>
           <w:rFonts w:asciiTheme="majorBidi" w:hAnsiTheme="majorBidi" w:cstheme="majorBidi"/>
         </w:rPr>
-        <w:t>Phase 1</w:t>
-      </w:r>
-      <w:r>
-        <w:rPr>
-          <w:rFonts w:asciiTheme="majorBidi" w:hAnsiTheme="majorBidi" w:cstheme="majorBidi"/>
-        </w:rPr>
-        <w:t>6</w:t>
-      </w:r>
-      <w:r>
-        <w:rPr>
-          <w:rFonts w:asciiTheme="majorBidi" w:hAnsiTheme="majorBidi" w:cstheme="majorBidi"/>
-        </w:rPr>
-        <w:t xml:space="preserve"> ]-</w:t>
-      </w:r>
-      <w:r>
-        <w:rPr>
-          <w:rFonts w:ascii="Nirmala UI" w:hAnsi="Nirmala UI" w:cs="Nirmala UI" w:hint="cs"/>
+        <w:t>Phase 16 ]-</w:t>
+      </w:r>
+      <w:r>
+        <w:rPr>
+          <w:rFonts w:ascii="Nirmala UI" w:hAnsi="Nirmala UI" w:cs="Nirmala UI"/>
           <w:cs/>
           <w:lang w:bidi="bn-IN"/>
         </w:rPr>
@@ -32946,15 +32912,15 @@
       </w:r>
       <w:r>
         <w:rPr>
-          <w:rFonts w:asciiTheme="majorBidi" w:hAnsiTheme="majorBidi" w:cstheme="majorBidi"/>
-          <w:cs/>
-          <w:lang w:bidi="bn-IN"/>
-        </w:rPr>
-        <w:t xml:space="preserve"> </w:t>
-      </w:r>
-      <w:r>
-        <w:rPr>
-          <w:rFonts w:ascii="Nirmala UI" w:hAnsi="Nirmala UI" w:cs="Nirmala UI" w:hint="cs"/>
+          <w:rFonts w:asciiTheme="majorBidi" w:hAnsiTheme="majorBidi" w:cs="Nirmala UI"/>
+          <w:cs/>
+          <w:lang w:bidi="bn-IN"/>
+        </w:rPr>
+        <w:t xml:space="preserve"> </w:t>
+      </w:r>
+      <w:r>
+        <w:rPr>
+          <w:rFonts w:ascii="Nirmala UI" w:hAnsi="Nirmala UI" w:cs="Nirmala UI"/>
           <w:cs/>
           <w:lang w:bidi="bn-IN"/>
         </w:rPr>
@@ -32962,15 +32928,15 @@
       </w:r>
       <w:r>
         <w:rPr>
-          <w:rFonts w:asciiTheme="majorBidi" w:hAnsiTheme="majorBidi" w:cstheme="majorBidi"/>
-          <w:cs/>
-          <w:lang w:bidi="bn-IN"/>
-        </w:rPr>
-        <w:t xml:space="preserve"> </w:t>
-      </w:r>
-      <w:r>
-        <w:rPr>
-          <w:rFonts w:ascii="Nirmala UI" w:hAnsi="Nirmala UI" w:cs="Nirmala UI" w:hint="cs"/>
+          <w:rFonts w:asciiTheme="majorBidi" w:hAnsiTheme="majorBidi" w:cs="Nirmala UI"/>
+          <w:cs/>
+          <w:lang w:bidi="bn-IN"/>
+        </w:rPr>
+        <w:t xml:space="preserve"> </w:t>
+      </w:r>
+      <w:r>
+        <w:rPr>
+          <w:rFonts w:ascii="Nirmala UI" w:hAnsi="Nirmala UI" w:cs="Nirmala UI"/>
           <w:cs/>
           <w:lang w:bidi="bn-IN"/>
         </w:rPr>
@@ -32978,15 +32944,15 @@
       </w:r>
       <w:r>
         <w:rPr>
-          <w:rFonts w:asciiTheme="majorBidi" w:hAnsiTheme="majorBidi" w:cstheme="majorBidi"/>
-          <w:cs/>
-          <w:lang w:bidi="bn-IN"/>
-        </w:rPr>
-        <w:t xml:space="preserve"> </w:t>
-      </w:r>
-      <w:r>
-        <w:rPr>
-          <w:rFonts w:ascii="Nirmala UI" w:hAnsi="Nirmala UI" w:cs="Nirmala UI" w:hint="cs"/>
+          <w:rFonts w:asciiTheme="majorBidi" w:hAnsiTheme="majorBidi" w:cs="Nirmala UI"/>
+          <w:cs/>
+          <w:lang w:bidi="bn-IN"/>
+        </w:rPr>
+        <w:t xml:space="preserve"> </w:t>
+      </w:r>
+      <w:r>
+        <w:rPr>
+          <w:rFonts w:ascii="Nirmala UI" w:hAnsi="Nirmala UI" w:cs="Nirmala UI"/>
           <w:cs/>
           <w:lang w:bidi="bn-IN"/>
         </w:rPr>
@@ -32994,15 +32960,15 @@
       </w:r>
       <w:r>
         <w:rPr>
-          <w:rFonts w:asciiTheme="majorBidi" w:hAnsiTheme="majorBidi" w:cstheme="majorBidi"/>
-          <w:cs/>
-          <w:lang w:bidi="bn-IN"/>
-        </w:rPr>
-        <w:t xml:space="preserve"> </w:t>
-      </w:r>
-      <w:r>
-        <w:rPr>
-          <w:rFonts w:ascii="Nirmala UI" w:hAnsi="Nirmala UI" w:cs="Nirmala UI" w:hint="cs"/>
+          <w:rFonts w:asciiTheme="majorBidi" w:hAnsiTheme="majorBidi" w:cs="Nirmala UI"/>
+          <w:cs/>
+          <w:lang w:bidi="bn-IN"/>
+        </w:rPr>
+        <w:t xml:space="preserve"> </w:t>
+      </w:r>
+      <w:r>
+        <w:rPr>
+          <w:rFonts w:ascii="Nirmala UI" w:hAnsi="Nirmala UI" w:cs="Nirmala UI"/>
           <w:cs/>
           <w:lang w:bidi="bn-IN"/>
         </w:rPr>
@@ -33010,15 +32976,15 @@
       </w:r>
       <w:r>
         <w:rPr>
-          <w:rFonts w:asciiTheme="majorBidi" w:hAnsiTheme="majorBidi" w:cstheme="majorBidi"/>
-          <w:cs/>
-          <w:lang w:bidi="bn-IN"/>
-        </w:rPr>
-        <w:t xml:space="preserve"> </w:t>
-      </w:r>
-      <w:r>
-        <w:rPr>
-          <w:rFonts w:ascii="Nirmala UI" w:hAnsi="Nirmala UI" w:cs="Nirmala UI" w:hint="cs"/>
+          <w:rFonts w:asciiTheme="majorBidi" w:hAnsiTheme="majorBidi" w:cs="Nirmala UI"/>
+          <w:cs/>
+          <w:lang w:bidi="bn-IN"/>
+        </w:rPr>
+        <w:t xml:space="preserve"> </w:t>
+      </w:r>
+      <w:r>
+        <w:rPr>
+          <w:rFonts w:ascii="Nirmala UI" w:hAnsi="Nirmala UI" w:cs="Nirmala UI"/>
           <w:cs/>
           <w:lang w:bidi="bn-IN"/>
         </w:rPr>
@@ -33026,15 +32992,15 @@
       </w:r>
       <w:r>
         <w:rPr>
-          <w:rFonts w:asciiTheme="majorBidi" w:hAnsiTheme="majorBidi" w:cstheme="majorBidi"/>
-          <w:cs/>
-          <w:lang w:bidi="bn-IN"/>
-        </w:rPr>
-        <w:t xml:space="preserve"> </w:t>
-      </w:r>
-      <w:r>
-        <w:rPr>
-          <w:rFonts w:ascii="Nirmala UI" w:hAnsi="Nirmala UI" w:cs="Nirmala UI" w:hint="cs"/>
+          <w:rFonts w:asciiTheme="majorBidi" w:hAnsiTheme="majorBidi" w:cs="Nirmala UI"/>
+          <w:cs/>
+          <w:lang w:bidi="bn-IN"/>
+        </w:rPr>
+        <w:t xml:space="preserve"> </w:t>
+      </w:r>
+      <w:r>
+        <w:rPr>
+          <w:rFonts w:ascii="Nirmala UI" w:hAnsi="Nirmala UI" w:cs="Nirmala UI"/>
           <w:cs/>
           <w:lang w:bidi="bn-IN"/>
         </w:rPr>
@@ -33042,15 +33008,15 @@
       </w:r>
       <w:r>
         <w:rPr>
-          <w:rFonts w:asciiTheme="majorBidi" w:hAnsiTheme="majorBidi" w:cstheme="majorBidi"/>
-          <w:cs/>
-          <w:lang w:bidi="bn-IN"/>
-        </w:rPr>
-        <w:t xml:space="preserve"> </w:t>
-      </w:r>
-      <w:r>
-        <w:rPr>
-          <w:rFonts w:ascii="Nirmala UI" w:hAnsi="Nirmala UI" w:cs="Nirmala UI" w:hint="cs"/>
+          <w:rFonts w:asciiTheme="majorBidi" w:hAnsiTheme="majorBidi" w:cs="Nirmala UI"/>
+          <w:cs/>
+          <w:lang w:bidi="bn-IN"/>
+        </w:rPr>
+        <w:t xml:space="preserve"> </w:t>
+      </w:r>
+      <w:r>
+        <w:rPr>
+          <w:rFonts w:ascii="Nirmala UI" w:hAnsi="Nirmala UI" w:cs="Nirmala UI"/>
           <w:cs/>
           <w:lang w:bidi="bn-IN"/>
         </w:rPr>
@@ -33058,15 +33024,15 @@
       </w:r>
       <w:r>
         <w:rPr>
-          <w:rFonts w:asciiTheme="majorBidi" w:hAnsiTheme="majorBidi" w:cstheme="majorBidi"/>
-          <w:cs/>
-          <w:lang w:bidi="bn-IN"/>
-        </w:rPr>
-        <w:t xml:space="preserve"> </w:t>
-      </w:r>
-      <w:r>
-        <w:rPr>
-          <w:rFonts w:ascii="Nirmala UI" w:hAnsi="Nirmala UI" w:cs="Nirmala UI" w:hint="cs"/>
+          <w:rFonts w:asciiTheme="majorBidi" w:hAnsiTheme="majorBidi" w:cs="Nirmala UI"/>
+          <w:cs/>
+          <w:lang w:bidi="bn-IN"/>
+        </w:rPr>
+        <w:t xml:space="preserve"> </w:t>
+      </w:r>
+      <w:r>
+        <w:rPr>
+          <w:rFonts w:ascii="Nirmala UI" w:hAnsi="Nirmala UI" w:cs="Nirmala UI"/>
           <w:cs/>
           <w:lang w:bidi="bn-IN"/>
         </w:rPr>
@@ -33103,7 +33069,7 @@
       </w:r>
       <w:r>
         <w:rPr>
-          <w:rFonts w:ascii="Nirmala UI" w:hAnsi="Nirmala UI" w:cs="Nirmala UI" w:hint="cs"/>
+          <w:rFonts w:ascii="Nirmala UI" w:hAnsi="Nirmala UI" w:cs="Nirmala UI"/>
           <w:cs/>
           <w:lang w:bidi="bn-IN"/>
         </w:rPr>
@@ -33111,15 +33077,15 @@
       </w:r>
       <w:r>
         <w:rPr>
-          <w:rFonts w:asciiTheme="majorBidi" w:hAnsiTheme="majorBidi" w:cstheme="majorBidi"/>
-          <w:cs/>
-          <w:lang w:bidi="bn-IN"/>
-        </w:rPr>
-        <w:t xml:space="preserve"> </w:t>
-      </w:r>
-      <w:r>
-        <w:rPr>
-          <w:rFonts w:ascii="Nirmala UI" w:hAnsi="Nirmala UI" w:cs="Nirmala UI" w:hint="cs"/>
+          <w:rFonts w:asciiTheme="majorBidi" w:hAnsiTheme="majorBidi" w:cs="Nirmala UI" w:hint="cs"/>
+          <w:cs/>
+          <w:lang w:bidi="bn-IN"/>
+        </w:rPr>
+        <w:t xml:space="preserve"> </w:t>
+      </w:r>
+      <w:r>
+        <w:rPr>
+          <w:rFonts w:ascii="Nirmala UI" w:hAnsi="Nirmala UI" w:cs="Nirmala UI"/>
           <w:cs/>
           <w:lang w:bidi="bn-IN"/>
         </w:rPr>
@@ -33127,15 +33093,15 @@
       </w:r>
       <w:r>
         <w:rPr>
-          <w:rFonts w:asciiTheme="majorBidi" w:hAnsiTheme="majorBidi" w:cstheme="majorBidi"/>
-          <w:cs/>
-          <w:lang w:bidi="bn-IN"/>
-        </w:rPr>
-        <w:t xml:space="preserve"> </w:t>
-      </w:r>
-      <w:r>
-        <w:rPr>
-          <w:rFonts w:ascii="Nirmala UI" w:hAnsi="Nirmala UI" w:cs="Nirmala UI" w:hint="cs"/>
+          <w:rFonts w:asciiTheme="majorBidi" w:hAnsiTheme="majorBidi" w:cs="Nirmala UI" w:hint="cs"/>
+          <w:cs/>
+          <w:lang w:bidi="bn-IN"/>
+        </w:rPr>
+        <w:t xml:space="preserve"> </w:t>
+      </w:r>
+      <w:r>
+        <w:rPr>
+          <w:rFonts w:ascii="Nirmala UI" w:hAnsi="Nirmala UI" w:cs="Nirmala UI"/>
           <w:cs/>
           <w:lang w:bidi="bn-IN"/>
         </w:rPr>
@@ -33143,15 +33109,15 @@
       </w:r>
       <w:r>
         <w:rPr>
-          <w:rFonts w:asciiTheme="majorBidi" w:hAnsiTheme="majorBidi" w:cstheme="majorBidi"/>
-          <w:cs/>
-          <w:lang w:bidi="bn-IN"/>
-        </w:rPr>
-        <w:t xml:space="preserve"> </w:t>
-      </w:r>
-      <w:r>
-        <w:rPr>
-          <w:rFonts w:ascii="Nirmala UI" w:hAnsi="Nirmala UI" w:cs="Nirmala UI" w:hint="cs"/>
+          <w:rFonts w:asciiTheme="majorBidi" w:hAnsiTheme="majorBidi" w:cs="Nirmala UI" w:hint="cs"/>
+          <w:cs/>
+          <w:lang w:bidi="bn-IN"/>
+        </w:rPr>
+        <w:t xml:space="preserve"> </w:t>
+      </w:r>
+      <w:r>
+        <w:rPr>
+          <w:rFonts w:ascii="Nirmala UI" w:hAnsi="Nirmala UI" w:cs="Nirmala UI"/>
           <w:cs/>
           <w:lang w:bidi="bn-IN"/>
         </w:rPr>
@@ -33159,15 +33125,15 @@
       </w:r>
       <w:r>
         <w:rPr>
-          <w:rFonts w:asciiTheme="majorBidi" w:hAnsiTheme="majorBidi" w:cstheme="majorBidi"/>
-          <w:cs/>
-          <w:lang w:bidi="bn-IN"/>
-        </w:rPr>
-        <w:t xml:space="preserve"> </w:t>
-      </w:r>
-      <w:r>
-        <w:rPr>
-          <w:rFonts w:ascii="Nirmala UI" w:hAnsi="Nirmala UI" w:cs="Nirmala UI" w:hint="cs"/>
+          <w:rFonts w:asciiTheme="majorBidi" w:hAnsiTheme="majorBidi" w:cs="Nirmala UI" w:hint="cs"/>
+          <w:cs/>
+          <w:lang w:bidi="bn-IN"/>
+        </w:rPr>
+        <w:t xml:space="preserve"> </w:t>
+      </w:r>
+      <w:r>
+        <w:rPr>
+          <w:rFonts w:ascii="Nirmala UI" w:hAnsi="Nirmala UI" w:cs="Nirmala UI"/>
           <w:cs/>
           <w:lang w:bidi="bn-IN"/>
         </w:rPr>
@@ -33175,15 +33141,15 @@
       </w:r>
       <w:r>
         <w:rPr>
-          <w:rFonts w:asciiTheme="majorBidi" w:hAnsiTheme="majorBidi" w:cstheme="majorBidi"/>
-          <w:cs/>
-          <w:lang w:bidi="bn-IN"/>
-        </w:rPr>
-        <w:t xml:space="preserve"> </w:t>
-      </w:r>
-      <w:r>
-        <w:rPr>
-          <w:rFonts w:ascii="Nirmala UI" w:hAnsi="Nirmala UI" w:cs="Nirmala UI" w:hint="cs"/>
+          <w:rFonts w:asciiTheme="majorBidi" w:hAnsiTheme="majorBidi" w:cs="Nirmala UI" w:hint="cs"/>
+          <w:cs/>
+          <w:lang w:bidi="bn-IN"/>
+        </w:rPr>
+        <w:t xml:space="preserve"> </w:t>
+      </w:r>
+      <w:r>
+        <w:rPr>
+          <w:rFonts w:ascii="Nirmala UI" w:hAnsi="Nirmala UI" w:cs="Nirmala UI"/>
           <w:cs/>
           <w:lang w:bidi="bn-IN"/>
         </w:rPr>
@@ -33191,15 +33157,15 @@
       </w:r>
       <w:r>
         <w:rPr>
-          <w:rFonts w:asciiTheme="majorBidi" w:hAnsiTheme="majorBidi" w:cstheme="majorBidi"/>
-          <w:cs/>
-          <w:lang w:bidi="bn-IN"/>
-        </w:rPr>
-        <w:t xml:space="preserve"> </w:t>
-      </w:r>
-      <w:r>
-        <w:rPr>
-          <w:rFonts w:ascii="Nirmala UI" w:hAnsi="Nirmala UI" w:cs="Nirmala UI" w:hint="cs"/>
+          <w:rFonts w:asciiTheme="majorBidi" w:hAnsiTheme="majorBidi" w:cs="Nirmala UI" w:hint="cs"/>
+          <w:cs/>
+          <w:lang w:bidi="bn-IN"/>
+        </w:rPr>
+        <w:t xml:space="preserve"> </w:t>
+      </w:r>
+      <w:r>
+        <w:rPr>
+          <w:rFonts w:ascii="Nirmala UI" w:hAnsi="Nirmala UI" w:cs="Nirmala UI"/>
           <w:cs/>
           <w:lang w:bidi="bn-IN"/>
         </w:rPr>
@@ -33207,15 +33173,15 @@
       </w:r>
       <w:r>
         <w:rPr>
-          <w:rFonts w:asciiTheme="majorBidi" w:hAnsiTheme="majorBidi" w:cstheme="majorBidi"/>
-          <w:cs/>
-          <w:lang w:bidi="bn-IN"/>
-        </w:rPr>
-        <w:t xml:space="preserve"> </w:t>
-      </w:r>
-      <w:r>
-        <w:rPr>
-          <w:rFonts w:ascii="Nirmala UI" w:hAnsi="Nirmala UI" w:cs="Nirmala UI" w:hint="cs"/>
+          <w:rFonts w:asciiTheme="majorBidi" w:hAnsiTheme="majorBidi" w:cs="Nirmala UI" w:hint="cs"/>
+          <w:cs/>
+          <w:lang w:bidi="bn-IN"/>
+        </w:rPr>
+        <w:t xml:space="preserve"> </w:t>
+      </w:r>
+      <w:r>
+        <w:rPr>
+          <w:rFonts w:ascii="Nirmala UI" w:hAnsi="Nirmala UI" w:cs="Nirmala UI"/>
           <w:cs/>
           <w:lang w:bidi="bn-IN"/>
         </w:rPr>
@@ -33223,15 +33189,15 @@
       </w:r>
       <w:r>
         <w:rPr>
-          <w:rFonts w:asciiTheme="majorBidi" w:hAnsiTheme="majorBidi" w:cstheme="majorBidi"/>
-          <w:cs/>
-          <w:lang w:bidi="bn-IN"/>
-        </w:rPr>
-        <w:t xml:space="preserve"> </w:t>
-      </w:r>
-      <w:r>
-        <w:rPr>
-          <w:rFonts w:ascii="Nirmala UI" w:hAnsi="Nirmala UI" w:cs="Nirmala UI" w:hint="cs"/>
+          <w:rFonts w:asciiTheme="majorBidi" w:hAnsiTheme="majorBidi" w:cs="Nirmala UI" w:hint="cs"/>
+          <w:cs/>
+          <w:lang w:bidi="bn-IN"/>
+        </w:rPr>
+        <w:t xml:space="preserve"> </w:t>
+      </w:r>
+      <w:r>
+        <w:rPr>
+          <w:rFonts w:ascii="Nirmala UI" w:hAnsi="Nirmala UI" w:cs="Nirmala UI"/>
           <w:cs/>
           <w:lang w:bidi="bn-IN"/>
         </w:rPr>
@@ -33239,15 +33205,15 @@
       </w:r>
       <w:r>
         <w:rPr>
-          <w:rFonts w:asciiTheme="majorBidi" w:hAnsiTheme="majorBidi" w:cstheme="majorBidi"/>
-          <w:cs/>
-          <w:lang w:bidi="bn-IN"/>
-        </w:rPr>
-        <w:t xml:space="preserve"> </w:t>
-      </w:r>
-      <w:r>
-        <w:rPr>
-          <w:rFonts w:ascii="Nirmala UI" w:hAnsi="Nirmala UI" w:cs="Nirmala UI" w:hint="cs"/>
+          <w:rFonts w:asciiTheme="majorBidi" w:hAnsiTheme="majorBidi" w:cs="Nirmala UI" w:hint="cs"/>
+          <w:cs/>
+          <w:lang w:bidi="bn-IN"/>
+        </w:rPr>
+        <w:t xml:space="preserve"> </w:t>
+      </w:r>
+      <w:r>
+        <w:rPr>
+          <w:rFonts w:ascii="Nirmala UI" w:hAnsi="Nirmala UI" w:cs="Nirmala UI"/>
           <w:cs/>
           <w:lang w:bidi="bn-IN"/>
         </w:rPr>
@@ -33255,15 +33221,15 @@
       </w:r>
       <w:r>
         <w:rPr>
-          <w:rFonts w:asciiTheme="majorBidi" w:hAnsiTheme="majorBidi" w:cstheme="majorBidi"/>
-          <w:cs/>
-          <w:lang w:bidi="bn-IN"/>
-        </w:rPr>
-        <w:t xml:space="preserve"> </w:t>
-      </w:r>
-      <w:r>
-        <w:rPr>
-          <w:rFonts w:ascii="Nirmala UI" w:hAnsi="Nirmala UI" w:cs="Nirmala UI" w:hint="cs"/>
+          <w:rFonts w:asciiTheme="majorBidi" w:hAnsiTheme="majorBidi" w:cs="Nirmala UI" w:hint="cs"/>
+          <w:cs/>
+          <w:lang w:bidi="bn-IN"/>
+        </w:rPr>
+        <w:t xml:space="preserve"> </w:t>
+      </w:r>
+      <w:r>
+        <w:rPr>
+          <w:rFonts w:ascii="Nirmala UI" w:hAnsi="Nirmala UI" w:cs="Nirmala UI"/>
           <w:cs/>
           <w:lang w:bidi="bn-IN"/>
         </w:rPr>
@@ -33271,15 +33237,15 @@
       </w:r>
       <w:r>
         <w:rPr>
-          <w:rFonts w:asciiTheme="majorBidi" w:hAnsiTheme="majorBidi" w:cstheme="majorBidi"/>
-          <w:cs/>
-          <w:lang w:bidi="bn-IN"/>
-        </w:rPr>
-        <w:t xml:space="preserve"> </w:t>
-      </w:r>
-      <w:r>
-        <w:rPr>
-          <w:rFonts w:ascii="Nirmala UI" w:hAnsi="Nirmala UI" w:cs="Nirmala UI" w:hint="cs"/>
+          <w:rFonts w:asciiTheme="majorBidi" w:hAnsiTheme="majorBidi" w:cs="Nirmala UI" w:hint="cs"/>
+          <w:cs/>
+          <w:lang w:bidi="bn-IN"/>
+        </w:rPr>
+        <w:t xml:space="preserve"> </w:t>
+      </w:r>
+      <w:r>
+        <w:rPr>
+          <w:rFonts w:ascii="Nirmala UI" w:hAnsi="Nirmala UI" w:cs="Nirmala UI"/>
           <w:cs/>
           <w:lang w:bidi="bn-IN"/>
         </w:rPr>
@@ -33287,15 +33253,15 @@
       </w:r>
       <w:r>
         <w:rPr>
-          <w:rFonts w:asciiTheme="majorBidi" w:hAnsiTheme="majorBidi" w:cstheme="majorBidi"/>
-          <w:cs/>
-          <w:lang w:bidi="bn-IN"/>
-        </w:rPr>
-        <w:t xml:space="preserve"> </w:t>
-      </w:r>
-      <w:r>
-        <w:rPr>
-          <w:rFonts w:ascii="Nirmala UI" w:hAnsi="Nirmala UI" w:cs="Nirmala UI" w:hint="cs"/>
+          <w:rFonts w:asciiTheme="majorBidi" w:hAnsiTheme="majorBidi" w:cs="Nirmala UI" w:hint="cs"/>
+          <w:cs/>
+          <w:lang w:bidi="bn-IN"/>
+        </w:rPr>
+        <w:t xml:space="preserve"> </w:t>
+      </w:r>
+      <w:r>
+        <w:rPr>
+          <w:rFonts w:ascii="Nirmala UI" w:hAnsi="Nirmala UI" w:cs="Nirmala UI"/>
           <w:cs/>
           <w:lang w:bidi="bn-IN"/>
         </w:rPr>
@@ -33303,15 +33269,15 @@
       </w:r>
       <w:r>
         <w:rPr>
-          <w:rFonts w:asciiTheme="majorBidi" w:hAnsiTheme="majorBidi" w:cstheme="majorBidi"/>
-          <w:cs/>
-          <w:lang w:bidi="bn-IN"/>
-        </w:rPr>
-        <w:t xml:space="preserve"> </w:t>
-      </w:r>
-      <w:r>
-        <w:rPr>
-          <w:rFonts w:ascii="Nirmala UI" w:hAnsi="Nirmala UI" w:cs="Nirmala UI" w:hint="cs"/>
+          <w:rFonts w:asciiTheme="majorBidi" w:hAnsiTheme="majorBidi" w:cs="Nirmala UI" w:hint="cs"/>
+          <w:cs/>
+          <w:lang w:bidi="bn-IN"/>
+        </w:rPr>
+        <w:t xml:space="preserve"> </w:t>
+      </w:r>
+      <w:r>
+        <w:rPr>
+          <w:rFonts w:ascii="Nirmala UI" w:hAnsi="Nirmala UI" w:cs="Nirmala UI"/>
           <w:cs/>
           <w:lang w:bidi="bn-IN"/>
         </w:rPr>
@@ -33319,15 +33285,15 @@
       </w:r>
       <w:r>
         <w:rPr>
-          <w:rFonts w:asciiTheme="majorBidi" w:hAnsiTheme="majorBidi" w:cstheme="majorBidi"/>
-          <w:cs/>
-          <w:lang w:bidi="bn-IN"/>
-        </w:rPr>
-        <w:t xml:space="preserve"> </w:t>
-      </w:r>
-      <w:r>
-        <w:rPr>
-          <w:rFonts w:ascii="Nirmala UI" w:hAnsi="Nirmala UI" w:cs="Nirmala UI" w:hint="cs"/>
+          <w:rFonts w:asciiTheme="majorBidi" w:hAnsiTheme="majorBidi" w:cs="Nirmala UI" w:hint="cs"/>
+          <w:cs/>
+          <w:lang w:bidi="bn-IN"/>
+        </w:rPr>
+        <w:t xml:space="preserve"> </w:t>
+      </w:r>
+      <w:r>
+        <w:rPr>
+          <w:rFonts w:ascii="Nirmala UI" w:hAnsi="Nirmala UI" w:cs="Nirmala UI"/>
           <w:cs/>
           <w:lang w:bidi="bn-IN"/>
         </w:rPr>
@@ -33335,7 +33301,7 @@
       </w:r>
       <w:r>
         <w:rPr>
-          <w:rFonts w:asciiTheme="majorBidi" w:hAnsiTheme="majorBidi" w:cstheme="majorBidi"/>
+          <w:rFonts w:asciiTheme="majorBidi" w:hAnsiTheme="majorBidi" w:cs="Nirmala UI" w:hint="cs"/>
           <w:cs/>
           <w:lang w:bidi="bn-IN"/>
         </w:rPr>
@@ -33349,7 +33315,7 @@
       </w:r>
       <w:r>
         <w:rPr>
-          <w:rFonts w:ascii="Nirmala UI" w:hAnsi="Nirmala UI" w:cs="Nirmala UI" w:hint="cs"/>
+          <w:rFonts w:ascii="Nirmala UI" w:hAnsi="Nirmala UI" w:cs="Nirmala UI"/>
           <w:cs/>
           <w:lang w:bidi="bn-IN"/>
         </w:rPr>
@@ -33357,15 +33323,15 @@
       </w:r>
       <w:r>
         <w:rPr>
-          <w:rFonts w:asciiTheme="majorBidi" w:hAnsiTheme="majorBidi" w:cstheme="majorBidi"/>
-          <w:cs/>
-          <w:lang w:bidi="bn-IN"/>
-        </w:rPr>
-        <w:t xml:space="preserve"> </w:t>
-      </w:r>
-      <w:r>
-        <w:rPr>
-          <w:rFonts w:ascii="Nirmala UI" w:hAnsi="Nirmala UI" w:cs="Nirmala UI" w:hint="cs"/>
+          <w:rFonts w:asciiTheme="majorBidi" w:hAnsiTheme="majorBidi" w:cs="Nirmala UI" w:hint="cs"/>
+          <w:cs/>
+          <w:lang w:bidi="bn-IN"/>
+        </w:rPr>
+        <w:t xml:space="preserve"> </w:t>
+      </w:r>
+      <w:r>
+        <w:rPr>
+          <w:rFonts w:ascii="Nirmala UI" w:hAnsi="Nirmala UI" w:cs="Nirmala UI"/>
           <w:cs/>
           <w:lang w:bidi="bn-IN"/>
         </w:rPr>
@@ -33373,15 +33339,15 @@
       </w:r>
       <w:r>
         <w:rPr>
-          <w:rFonts w:asciiTheme="majorBidi" w:hAnsiTheme="majorBidi" w:cstheme="majorBidi"/>
-          <w:cs/>
-          <w:lang w:bidi="bn-IN"/>
-        </w:rPr>
-        <w:t xml:space="preserve"> </w:t>
-      </w:r>
-      <w:r>
-        <w:rPr>
-          <w:rFonts w:ascii="Nirmala UI" w:hAnsi="Nirmala UI" w:cs="Nirmala UI" w:hint="cs"/>
+          <w:rFonts w:asciiTheme="majorBidi" w:hAnsiTheme="majorBidi" w:cs="Nirmala UI" w:hint="cs"/>
+          <w:cs/>
+          <w:lang w:bidi="bn-IN"/>
+        </w:rPr>
+        <w:t xml:space="preserve"> </w:t>
+      </w:r>
+      <w:r>
+        <w:rPr>
+          <w:rFonts w:ascii="Nirmala UI" w:hAnsi="Nirmala UI" w:cs="Nirmala UI"/>
           <w:cs/>
           <w:lang w:bidi="bn-IN"/>
         </w:rPr>
@@ -33389,15 +33355,15 @@
       </w:r>
       <w:r>
         <w:rPr>
-          <w:rFonts w:asciiTheme="majorBidi" w:hAnsiTheme="majorBidi" w:cstheme="majorBidi"/>
-          <w:cs/>
-          <w:lang w:bidi="bn-IN"/>
-        </w:rPr>
-        <w:t xml:space="preserve"> </w:t>
-      </w:r>
-      <w:r>
-        <w:rPr>
-          <w:rFonts w:ascii="Nirmala UI" w:hAnsi="Nirmala UI" w:cs="Nirmala UI" w:hint="cs"/>
+          <w:rFonts w:asciiTheme="majorBidi" w:hAnsiTheme="majorBidi" w:cs="Nirmala UI" w:hint="cs"/>
+          <w:cs/>
+          <w:lang w:bidi="bn-IN"/>
+        </w:rPr>
+        <w:t xml:space="preserve"> </w:t>
+      </w:r>
+      <w:r>
+        <w:rPr>
+          <w:rFonts w:ascii="Nirmala UI" w:hAnsi="Nirmala UI" w:cs="Nirmala UI"/>
           <w:cs/>
           <w:lang w:bidi="bn-IN"/>
         </w:rPr>
@@ -33405,15 +33371,15 @@
       </w:r>
       <w:r>
         <w:rPr>
-          <w:rFonts w:asciiTheme="majorBidi" w:hAnsiTheme="majorBidi" w:cstheme="majorBidi"/>
-          <w:cs/>
-          <w:lang w:bidi="bn-IN"/>
-        </w:rPr>
-        <w:t xml:space="preserve"> </w:t>
-      </w:r>
-      <w:r>
-        <w:rPr>
-          <w:rFonts w:ascii="Nirmala UI" w:hAnsi="Nirmala UI" w:cs="Nirmala UI" w:hint="cs"/>
+          <w:rFonts w:asciiTheme="majorBidi" w:hAnsiTheme="majorBidi" w:cs="Nirmala UI" w:hint="cs"/>
+          <w:cs/>
+          <w:lang w:bidi="bn-IN"/>
+        </w:rPr>
+        <w:t xml:space="preserve"> </w:t>
+      </w:r>
+      <w:r>
+        <w:rPr>
+          <w:rFonts w:ascii="Nirmala UI" w:hAnsi="Nirmala UI" w:cs="Nirmala UI"/>
           <w:cs/>
           <w:lang w:bidi="bn-IN"/>
         </w:rPr>
@@ -33421,15 +33387,15 @@
       </w:r>
       <w:r>
         <w:rPr>
-          <w:rFonts w:asciiTheme="majorBidi" w:hAnsiTheme="majorBidi" w:cstheme="majorBidi"/>
-          <w:cs/>
-          <w:lang w:bidi="bn-IN"/>
-        </w:rPr>
-        <w:t xml:space="preserve"> </w:t>
-      </w:r>
-      <w:r>
-        <w:rPr>
-          <w:rFonts w:ascii="Nirmala UI" w:hAnsi="Nirmala UI" w:cs="Nirmala UI" w:hint="cs"/>
+          <w:rFonts w:asciiTheme="majorBidi" w:hAnsiTheme="majorBidi" w:cs="Nirmala UI" w:hint="cs"/>
+          <w:cs/>
+          <w:lang w:bidi="bn-IN"/>
+        </w:rPr>
+        <w:t xml:space="preserve"> </w:t>
+      </w:r>
+      <w:r>
+        <w:rPr>
+          <w:rFonts w:ascii="Nirmala UI" w:hAnsi="Nirmala UI" w:cs="Nirmala UI"/>
           <w:cs/>
           <w:lang w:bidi="bn-IN"/>
         </w:rPr>
@@ -33437,15 +33403,15 @@
       </w:r>
       <w:r>
         <w:rPr>
-          <w:rFonts w:asciiTheme="majorBidi" w:hAnsiTheme="majorBidi" w:cstheme="majorBidi"/>
-          <w:cs/>
-          <w:lang w:bidi="bn-IN"/>
-        </w:rPr>
-        <w:t xml:space="preserve"> </w:t>
-      </w:r>
-      <w:r>
-        <w:rPr>
-          <w:rFonts w:ascii="Nirmala UI" w:hAnsi="Nirmala UI" w:cs="Nirmala UI" w:hint="cs"/>
+          <w:rFonts w:asciiTheme="majorBidi" w:hAnsiTheme="majorBidi" w:cs="Nirmala UI" w:hint="cs"/>
+          <w:cs/>
+          <w:lang w:bidi="bn-IN"/>
+        </w:rPr>
+        <w:t xml:space="preserve"> </w:t>
+      </w:r>
+      <w:r>
+        <w:rPr>
+          <w:rFonts w:ascii="Nirmala UI" w:hAnsi="Nirmala UI" w:cs="Nirmala UI"/>
           <w:cs/>
           <w:lang w:bidi="bn-IN"/>
         </w:rPr>
@@ -33453,15 +33419,15 @@
       </w:r>
       <w:r>
         <w:rPr>
-          <w:rFonts w:asciiTheme="majorBidi" w:hAnsiTheme="majorBidi" w:cstheme="majorBidi"/>
-          <w:cs/>
-          <w:lang w:bidi="bn-IN"/>
-        </w:rPr>
-        <w:t xml:space="preserve"> </w:t>
-      </w:r>
-      <w:r>
-        <w:rPr>
-          <w:rFonts w:ascii="Nirmala UI" w:hAnsi="Nirmala UI" w:cs="Nirmala UI" w:hint="cs"/>
+          <w:rFonts w:asciiTheme="majorBidi" w:hAnsiTheme="majorBidi" w:cs="Nirmala UI" w:hint="cs"/>
+          <w:cs/>
+          <w:lang w:bidi="bn-IN"/>
+        </w:rPr>
+        <w:t xml:space="preserve"> </w:t>
+      </w:r>
+      <w:r>
+        <w:rPr>
+          <w:rFonts w:ascii="Nirmala UI" w:hAnsi="Nirmala UI" w:cs="Nirmala UI"/>
           <w:cs/>
           <w:lang w:bidi="bn-IN"/>
         </w:rPr>
@@ -33495,7 +33461,15 @@
           <w:cs/>
           <w:lang w:bidi="bn-IN"/>
         </w:rPr>
-        <w:t>নিছের</w:t>
+        <w:t>নিছের কাজ</w:t>
+      </w:r>
+      <w:r>
+        <w:rPr>
+          <w:rFonts w:asciiTheme="majorBidi" w:hAnsiTheme="majorBidi" w:cs="Nirmala UI" w:hint="cs"/>
+          <w:cs/>
+          <w:lang w:bidi="bn-IN"/>
+        </w:rPr>
+        <w:t xml:space="preserve"> </w:t>
       </w:r>
       <w:r>
         <w:rPr>
@@ -33503,39 +33477,15 @@
           <w:cs/>
           <w:lang w:bidi="bn-IN"/>
         </w:rPr>
-        <w:t xml:space="preserve"> কাজ</w:t>
-      </w:r>
-      <w:r>
-        <w:rPr>
-          <w:rFonts w:asciiTheme="majorBidi" w:hAnsiTheme="majorBidi" w:cstheme="majorBidi"/>
-          <w:cs/>
-          <w:lang w:bidi="bn-IN"/>
-        </w:rPr>
-        <w:t xml:space="preserve"> </w:t>
-      </w:r>
-      <w:r>
-        <w:rPr>
-          <w:rFonts w:ascii="Nirmala UI" w:hAnsi="Nirmala UI" w:cs="Nirmala UI" w:hint="cs"/>
-          <w:cs/>
-          <w:lang w:bidi="bn-IN"/>
-        </w:rPr>
         <w:t>গুলি</w:t>
       </w:r>
       <w:r>
         <w:rPr>
-          <w:rFonts w:asciiTheme="majorBidi" w:hAnsiTheme="majorBidi" w:cstheme="majorBidi"/>
-          <w:cs/>
-          <w:lang w:bidi="bn-IN"/>
-        </w:rPr>
-        <w:t xml:space="preserve"> </w:t>
-      </w:r>
-      <w:r>
-        <w:rPr>
-          <w:rFonts w:ascii="Nirmala UI" w:hAnsi="Nirmala UI" w:cs="Nirmala UI" w:hint="cs"/>
-          <w:cs/>
-          <w:lang w:bidi="bn-IN"/>
-        </w:rPr>
-        <w:t>কখ</w:t>
+          <w:rFonts w:asciiTheme="majorBidi" w:hAnsiTheme="majorBidi" w:cs="Nirmala UI" w:hint="cs"/>
+          <w:cs/>
+          <w:lang w:bidi="bn-IN"/>
+        </w:rPr>
+        <w:t xml:space="preserve"> </w:t>
       </w:r>
       <w:r>
         <w:rPr>
@@ -33543,19 +33493,19 @@
           <w:cs/>
           <w:lang w:bidi="bn-IN"/>
         </w:rPr>
-        <w:t>নো</w:t>
-      </w:r>
-      <w:r>
-        <w:rPr>
-          <w:rFonts w:asciiTheme="majorBidi" w:hAnsiTheme="majorBidi" w:cstheme="majorBidi"/>
-          <w:cs/>
-          <w:lang w:bidi="bn-IN"/>
-        </w:rPr>
-        <w:t xml:space="preserve"> </w:t>
-      </w:r>
-      <w:r>
-        <w:rPr>
-          <w:rFonts w:ascii="Nirmala UI" w:hAnsi="Nirmala UI" w:cs="Nirmala UI" w:hint="cs"/>
+        <w:t>কখনো</w:t>
+      </w:r>
+      <w:r>
+        <w:rPr>
+          <w:rFonts w:asciiTheme="majorBidi" w:hAnsiTheme="majorBidi" w:cs="Nirmala UI" w:hint="cs"/>
+          <w:cs/>
+          <w:lang w:bidi="bn-IN"/>
+        </w:rPr>
+        <w:t xml:space="preserve"> </w:t>
+      </w:r>
+      <w:r>
+        <w:rPr>
+          <w:rFonts w:ascii="Nirmala UI" w:hAnsi="Nirmala UI" w:cs="Nirmala UI"/>
           <w:cs/>
           <w:lang w:bidi="bn-IN"/>
         </w:rPr>
@@ -33563,15 +33513,15 @@
       </w:r>
       <w:r>
         <w:rPr>
-          <w:rFonts w:asciiTheme="majorBidi" w:hAnsiTheme="majorBidi" w:cstheme="majorBidi"/>
-          <w:cs/>
-          <w:lang w:bidi="bn-IN"/>
-        </w:rPr>
-        <w:t xml:space="preserve"> </w:t>
-      </w:r>
-      <w:r>
-        <w:rPr>
-          <w:rFonts w:ascii="Nirmala UI" w:hAnsi="Nirmala UI" w:cs="Nirmala UI" w:hint="cs"/>
+          <w:rFonts w:asciiTheme="majorBidi" w:hAnsiTheme="majorBidi" w:cs="Nirmala UI" w:hint="cs"/>
+          <w:cs/>
+          <w:lang w:bidi="bn-IN"/>
+        </w:rPr>
+        <w:t xml:space="preserve"> </w:t>
+      </w:r>
+      <w:r>
+        <w:rPr>
+          <w:rFonts w:ascii="Nirmala UI" w:hAnsi="Nirmala UI" w:cs="Nirmala UI"/>
           <w:cs/>
           <w:lang w:bidi="bn-IN"/>
         </w:rPr>
@@ -33579,19 +33529,11 @@
       </w:r>
       <w:r>
         <w:rPr>
-          <w:rFonts w:asciiTheme="majorBidi" w:hAnsiTheme="majorBidi" w:cstheme="majorBidi"/>
-          <w:cs/>
-          <w:lang w:bidi="bn-IN"/>
-        </w:rPr>
-        <w:t xml:space="preserve"> </w:t>
-      </w:r>
-      <w:r>
-        <w:rPr>
-          <w:rFonts w:ascii="Nirmala UI" w:hAnsi="Nirmala UI" w:cs="Nirmala UI" w:hint="cs"/>
-          <w:cs/>
-          <w:lang w:bidi="bn-IN"/>
-        </w:rPr>
-        <w:t>না।</w:t>
+          <w:rFonts w:asciiTheme="majorBidi" w:hAnsiTheme="majorBidi" w:cs="Nirmala UI" w:hint="cs"/>
+          <w:cs/>
+          <w:lang w:bidi="bn-IN"/>
+        </w:rPr>
+        <w:t xml:space="preserve"> </w:t>
       </w:r>
       <w:r>
         <w:rPr>
@@ -33599,7 +33541,7 @@
           <w:cs/>
           <w:lang w:bidi="bn-IN"/>
         </w:rPr>
-        <w:t xml:space="preserve"> ঠিক আছে</w:t>
+        <w:t>না। ঠিক আছে</w:t>
       </w:r>
       <w:r>
         <w:rPr>
@@ -33609,7 +33551,7 @@
       </w:r>
       <w:r>
         <w:rPr>
-          <w:rFonts w:ascii="Nirmala UI" w:hAnsi="Nirmala UI" w:cs="Nirmala UI" w:hint="cs"/>
+          <w:rFonts w:ascii="Nirmala UI" w:hAnsi="Nirmala UI" w:cs="Nirmala UI"/>
           <w:cs/>
           <w:lang w:bidi="bn-IN"/>
         </w:rPr>
@@ -33617,15 +33559,15 @@
       </w:r>
       <w:r>
         <w:rPr>
-          <w:rFonts w:asciiTheme="majorBidi" w:hAnsiTheme="majorBidi" w:cstheme="majorBidi"/>
-          <w:cs/>
-          <w:lang w:bidi="bn-IN"/>
-        </w:rPr>
-        <w:t xml:space="preserve"> </w:t>
-      </w:r>
-      <w:r>
-        <w:rPr>
-          <w:rFonts w:ascii="Nirmala UI" w:hAnsi="Nirmala UI" w:cs="Nirmala UI" w:hint="cs"/>
+          <w:rFonts w:asciiTheme="majorBidi" w:hAnsiTheme="majorBidi" w:cs="Nirmala UI" w:hint="cs"/>
+          <w:cs/>
+          <w:lang w:bidi="bn-IN"/>
+        </w:rPr>
+        <w:t xml:space="preserve"> </w:t>
+      </w:r>
+      <w:r>
+        <w:rPr>
+          <w:rFonts w:ascii="Nirmala UI" w:hAnsi="Nirmala UI" w:cs="Nirmala UI"/>
           <w:cs/>
           <w:lang w:bidi="bn-IN"/>
         </w:rPr>
@@ -33633,15 +33575,15 @@
       </w:r>
       <w:r>
         <w:rPr>
-          <w:rFonts w:asciiTheme="majorBidi" w:hAnsiTheme="majorBidi" w:cstheme="majorBidi"/>
-          <w:cs/>
-          <w:lang w:bidi="bn-IN"/>
-        </w:rPr>
-        <w:t xml:space="preserve"> </w:t>
-      </w:r>
-      <w:r>
-        <w:rPr>
-          <w:rFonts w:ascii="Nirmala UI" w:hAnsi="Nirmala UI" w:cs="Nirmala UI" w:hint="cs"/>
+          <w:rFonts w:asciiTheme="majorBidi" w:hAnsiTheme="majorBidi" w:cs="Nirmala UI" w:hint="cs"/>
+          <w:cs/>
+          <w:lang w:bidi="bn-IN"/>
+        </w:rPr>
+        <w:t xml:space="preserve"> </w:t>
+      </w:r>
+      <w:r>
+        <w:rPr>
+          <w:rFonts w:ascii="Nirmala UI" w:hAnsi="Nirmala UI" w:cs="Nirmala UI"/>
           <w:cs/>
           <w:lang w:bidi="bn-IN"/>
         </w:rPr>
@@ -33661,7 +33603,7 @@
       </w:r>
       <w:r>
         <w:rPr>
-          <w:rFonts w:ascii="Nirmala UI" w:hAnsi="Nirmala UI" w:cs="Nirmala UI" w:hint="cs"/>
+          <w:rFonts w:ascii="Nirmala UI" w:hAnsi="Nirmala UI" w:cs="Nirmala UI"/>
           <w:cs/>
           <w:lang w:bidi="bn-IN"/>
         </w:rPr>
@@ -33669,15 +33611,15 @@
       </w:r>
       <w:r>
         <w:rPr>
-          <w:rFonts w:asciiTheme="majorBidi" w:hAnsiTheme="majorBidi" w:cstheme="majorBidi"/>
-          <w:cs/>
-          <w:lang w:bidi="bn-IN"/>
-        </w:rPr>
-        <w:t xml:space="preserve"> </w:t>
-      </w:r>
-      <w:r>
-        <w:rPr>
-          <w:rFonts w:ascii="Nirmala UI" w:hAnsi="Nirmala UI" w:cs="Nirmala UI" w:hint="cs"/>
+          <w:rFonts w:asciiTheme="majorBidi" w:hAnsiTheme="majorBidi" w:cs="Nirmala UI" w:hint="cs"/>
+          <w:cs/>
+          <w:lang w:bidi="bn-IN"/>
+        </w:rPr>
+        <w:t xml:space="preserve"> </w:t>
+      </w:r>
+      <w:r>
+        <w:rPr>
+          <w:rFonts w:ascii="Nirmala UI" w:hAnsi="Nirmala UI" w:cs="Nirmala UI"/>
           <w:cs/>
           <w:lang w:bidi="bn-IN"/>
         </w:rPr>
@@ -33710,6 +33652,8 @@
       <w:pPr>
         <w:pStyle w:val="NormalWeb"/>
       </w:pPr>
+      <w:bookmarkStart w:id="0" w:name="_GoBack"/>
+      <w:bookmarkEnd w:id="0"/>
     </w:p>
     <w:p>
       <w:pPr>
@@ -33737,10 +33681,12 @@
     </w:p>
     <w:p>
       <w:proofErr w:type="spellStart"/>
+      <w:proofErr w:type="gramStart"/>
       <w:r>
         <w:t>npm</w:t>
       </w:r>
       <w:proofErr w:type="spellEnd"/>
+      <w:proofErr w:type="gramEnd"/>
       <w:r>
         <w:t xml:space="preserve"> install </w:t>
       </w:r>
@@ -33748,9 +33694,14 @@
       <w:r>
         <w:t>recharts</w:t>
       </w:r>
-      <w:bookmarkStart w:id="0" w:name="_GoBack"/>
-      <w:bookmarkEnd w:id="0"/>
       <w:proofErr w:type="spellEnd"/>
+    </w:p>
+    <w:p>
+      <w:pPr>
+        <w:rPr>
+          <w:rFonts w:asciiTheme="majorBidi" w:hAnsiTheme="majorBidi" w:cstheme="majorBidi"/>
+        </w:rPr>
+      </w:pPr>
     </w:p>
     <w:sectPr>
       <w:pgSz w:w="12240" w:h="15840"/>

</xml_diff>